<commit_message>
fix(simulations): repair cli setup and add sensitivity comparison
- target Python 3.12 and explain the SciPy DLL recovery path
- add predefined scenario comparison and sensitivity CSV output
- synchronize submission documentation, source PDF, and dependencies
</commit_message>
<xml_diff>
--- a/submission/working_simulation_artifact.docx
+++ b/submission/working_simulation_artifact.docx
@@ -362,7 +362,7 @@
                 <w:rFonts w:ascii="Aptos" w:hAnsi="Aptos"/>
                 <w:sz w:val="17"/>
               </w:rPr>
-              <w:t>Terminal dependencies: NumPy, pandas, scikit-learn</w:t>
+              <w:t>Terminal dependencies: NumPy, pandas, SciPy, scikit-learn</w:t>
             </w:r>
           </w:p>
         </w:tc>
@@ -535,7 +535,7 @@
     </w:p>
     <w:p>
       <w:r>
-        <w:t>Open PowerShell in the project folder. Use Python 3.12 or a compatible Python 3 installation. Run these commands in order:</w:t>
+        <w:t>Open PowerShell in the project folder. Use Python 3.12 for the scientific Python wheels used by this project. Run these commands in order:</w:t>
       </w:r>
     </w:p>
     <w:p>
@@ -544,7 +544,7 @@
           <w:rFonts w:ascii="Consolas" w:hAnsi="Consolas"/>
           <w:sz w:val="18"/>
         </w:rPr>
-        <w:t>py -m venv .venv</w:t>
+        <w:t>py -3.12 -m venv .venv</w:t>
       </w:r>
     </w:p>
     <w:p>
@@ -567,7 +567,7 @@
     </w:p>
     <w:p>
       <w:r>
-        <w:t>The program asks for scenario 1-5, then a year from 2025 through 2035; pressing Enter selects 2035. After the result box, answer y to export the entire scenario to outputs/terminal/&lt;scenario&gt;/ or n to return to the menu. Enter 0 at the menu to quit. The relative CSV path assumes the supplied project folder structure remains intact. If Python's Windows launcher is unavailable, install Python or use the full path to a compatible Python executable.</w:t>
+        <w:t>The program asks for scenario 1-6. Option 6 shows a sensitivity comparison for the four predefined scenarios at 2025, 2030, and 2035. Options 1-5 then ask for a year from 2025 through 2035; pressing Enter selects 2035. After a scenario result, answer y to export the entire scenario to outputs/terminal/&lt;scenario&gt;/ or n to return to the menu. Enter 0 at the menu to quit. If an existing environment was created with Python 3.14, recreate .venv with the Python 3.12 command above; this avoids the Windows SciPy DLL import error shown by scikit-learn.</w:t>
       </w:r>
     </w:p>
     <w:p>
@@ -632,6 +632,14 @@
       </w:pPr>
       <w:r>
         <w:t>Display the selected-year risk box and optionally export the full annual result table.</w:t>
+      </w:r>
+    </w:p>
+    <w:p>
+      <w:pPr>
+        <w:pStyle w:val="ListBullet"/>
+      </w:pPr>
+      <w:r>
+        <w:t>Compare predefined scenarios at three milestone years as a sensitivity view; this is not a probability forecast.</w:t>
       </w:r>
     </w:p>
     <w:p>

</xml_diff>

<commit_message>
fix(cli): simplify setup commands and package error output
- restore the concise Python 3.12 setup commands
- replace the dependency traceback with a clear policy notice
- refresh the submission guide and source PDF
</commit_message>
<xml_diff>
--- a/submission/working_simulation_artifact.docx
+++ b/submission/working_simulation_artifact.docx
@@ -535,7 +535,7 @@
     </w:p>
     <w:p>
       <w:r>
-        <w:t>Open PowerShell in the project folder. Use Python 3.12 for the scientific Python wheels used by this project. Run these commands in order:</w:t>
+        <w:t>Open PowerShell in the repository root and use Python 3.12. Run these three commands in order:</w:t>
       </w:r>
     </w:p>
     <w:p>
@@ -544,7 +544,7 @@
           <w:rFonts w:ascii="Consolas" w:hAnsi="Consolas"/>
           <w:sz w:val="18"/>
         </w:rPr>
-        <w:t>py -3.12 -m venv .venv</w:t>
+        <w:t>py -3.12 -m venv --clear .venv</w:t>
       </w:r>
     </w:p>
     <w:p>
@@ -567,7 +567,7 @@
     </w:p>
     <w:p>
       <w:r>
-        <w:t>The program asks for scenario 1-6. Option 6 shows a sensitivity comparison for the four predefined scenarios at 2025, 2030, and 2035. Options 1-5 then ask for a year from 2025 through 2035; pressing Enter selects 2035. After a scenario result, answer y to export the entire scenario to outputs/terminal/&lt;scenario&gt;/ or n to return to the menu. Enter 0 at the menu to quit. If an existing environment was created with Python 3.14, recreate .venv with the Python 3.12 command above; this avoids the Windows SciPy DLL import error shown by scikit-learn.</w:t>
+        <w:t>To run it again later, use only .\.venv\Scripts\python run_simulation.py from the repository root. If Windows reports that an Application Control policy blocked a compiled scientific Python file, changing the commands or reinstalling packages cannot remove that restriction; use an IT-approved computer or ask the administrator to approve the packages. The program asks for scenario 1-6. Option 6 shows a sensitivity comparison for the four predefined scenarios at 2025, 2030, and 2035. Options 1-5 then ask for a year from 2025 through 2035; pressing Enter selects 2035. After a scenario result, answer y to export the entire scenario to outputs/terminal/&lt;scenario&gt;/ or n to return to the menu. Enter 0 at the menu to quit.</w:t>
       </w:r>
     </w:p>
     <w:p>

</xml_diff>

<commit_message>
fix(simulations): restore the october 5 simulation snapshot
- restore simulation code and artifacts to `4708e72`
- remove changes made after the october 5 version
</commit_message>
<xml_diff>
--- a/submission/working_simulation_artifact.docx
+++ b/submission/working_simulation_artifact.docx
@@ -362,7 +362,7 @@
                 <w:rFonts w:ascii="Aptos" w:hAnsi="Aptos"/>
                 <w:sz w:val="17"/>
               </w:rPr>
-              <w:t>Terminal dependencies: NumPy, pandas, SciPy, scikit-learn</w:t>
+              <w:t>Terminal dependencies: NumPy, pandas, scikit-learn</w:t>
             </w:r>
           </w:p>
         </w:tc>
@@ -535,7 +535,7 @@
     </w:p>
     <w:p>
       <w:r>
-        <w:t>Open PowerShell in the repository root and use Python 3.12. Run these three commands in order:</w:t>
+        <w:t>Open PowerShell in the project folder. Use Python 3.12 or a compatible Python 3 installation. Run these commands in order:</w:t>
       </w:r>
     </w:p>
     <w:p>
@@ -544,7 +544,7 @@
           <w:rFonts w:ascii="Consolas" w:hAnsi="Consolas"/>
           <w:sz w:val="18"/>
         </w:rPr>
-        <w:t>py -3.12 -m venv --clear .venv</w:t>
+        <w:t>py -m venv .venv</w:t>
       </w:r>
     </w:p>
     <w:p>
@@ -567,7 +567,7 @@
     </w:p>
     <w:p>
       <w:r>
-        <w:t>To run it again later, use only .\.venv\Scripts\python run_simulation.py from the repository root. If Windows reports that an Application Control policy blocked a compiled scientific Python file, changing the commands or reinstalling packages cannot remove that restriction; use an IT-approved computer or ask the administrator to approve the packages. The program asks for scenario 1-6. Option 6 shows a sensitivity comparison for the four predefined scenarios at 2025, 2030, and 2035. Options 1-5 then ask for a year from 2025 through 2035; pressing Enter selects 2035. After a scenario result, answer y to export the entire scenario to outputs/terminal/&lt;scenario&gt;/ or n to return to the menu. Enter 0 at the menu to quit.</w:t>
+        <w:t>The program asks for scenario 1-5, then a year from 2025 through 2035; pressing Enter selects 2035. After the result box, answer y to export the entire scenario to outputs/terminal/&lt;scenario&gt;/ or n to return to the menu. Enter 0 at the menu to quit. The relative CSV path assumes the supplied project folder structure remains intact. If Python's Windows launcher is unavailable, install Python or use the full path to a compatible Python executable.</w:t>
       </w:r>
     </w:p>
     <w:p>
@@ -632,14 +632,6 @@
       </w:pPr>
       <w:r>
         <w:t>Display the selected-year risk box and optionally export the full annual result table.</w:t>
-      </w:r>
-    </w:p>
-    <w:p>
-      <w:pPr>
-        <w:pStyle w:val="ListBullet"/>
-      </w:pPr>
-      <w:r>
-        <w:t>Compare predefined scenarios at three milestone years as a sensitivity view; this is not a probability forecast.</w:t>
       </w:r>
     </w:p>
     <w:p>

</xml_diff>